<commit_message>
docs: sync evidence and llm wiki updates
</commit_message>
<xml_diff>
--- a/assets/originals/20260406_③_2026_KIT_바이브코딩_공모전_팀명_개인은_이름_AI리포트.docx
+++ b/assets/originals/20260406_③_2026_KIT_바이브코딩_공모전_팀명_개인은_이름_AI리포트.docx
@@ -129,6 +129,14 @@
                 <w:szCs w:val="22"/>
               </w:rPr>
             </w:pPr>
+            <w:r>
+              <w:rPr>
+                <w:rFonts w:ascii="Pretendard" w:eastAsia="Pretendard" w:hAnsi="Pretendard" w:hint="eastAsia"/>
+                <w:sz w:val="20"/>
+                <w:szCs w:val="22"/>
+              </w:rPr>
+              <w:t>망상궤도</w:t>
+            </w:r>
           </w:p>
         </w:tc>
         <w:tc>
@@ -754,7 +762,7 @@
       <w:pPr>
         <w:spacing w:line="276" w:lineRule="auto"/>
         <w:rPr>
-          <w:rFonts w:ascii="Pretendard" w:eastAsia="Pretendard" w:hAnsi="Pretendard" w:hint="eastAsia"/>
+          <w:rFonts w:ascii="Pretendard" w:eastAsia="Pretendard" w:hAnsi="Pretendard"/>
         </w:rPr>
       </w:pPr>
     </w:p>
@@ -2032,6 +2040,7 @@
   <w:style w:type="character" w:default="1" w:styleId="a0">
     <w:name w:val="Default Paragraph Font"/>
     <w:uiPriority w:val="1"/>
+    <w:semiHidden/>
     <w:unhideWhenUsed/>
   </w:style>
   <w:style w:type="table" w:default="1" w:styleId="a1">

</xml_diff>